<commit_message>
new chap 6 formatting
</commit_message>
<xml_diff>
--- a/chapters/GTIchap6.docx
+++ b/chapters/GTIchap6.docx
@@ -477,11 +477,47 @@
           <w:rtl w:val="0"/>
         </w:rPr>
         <w:t xml:space="preserve">“Weigh... Heavy..?” said Rigel. “The murder of my father, you ask if it weighs heavy on me?” He almost paused his footsteps to bury his head in his hands, but his imagination sufficed in this instance as he continued on down the hall. </w:t>
-        <w:br w:type="textWrapping"/>
-        <w:tab/>
+      </w:r>
+    </w:p>
+    <w:p>
+      <w:pPr>
+        <w:ind w:left="0" w:firstLine="720"/>
+        <w:rPr>
+          <w:rFonts w:ascii="Montserrat" w:cs="Montserrat" w:eastAsia="Montserrat" w:hAnsi="Montserrat"/>
+          <w:color w:val="ffffff"/>
+          <w:sz w:val="28"/>
+          <w:szCs w:val="28"/>
+        </w:rPr>
+      </w:pPr>
+      <w:r>
+        <w:rPr>
+          <w:rFonts w:ascii="Montserrat" w:cs="Montserrat" w:eastAsia="Montserrat" w:hAnsi="Montserrat"/>
+          <w:color w:val="ffffff"/>
+          <w:sz w:val="28"/>
+          <w:szCs w:val="28"/>
+          <w:rtl w:val="0"/>
+        </w:rPr>
         <w:t xml:space="preserve">"It is not fitting for me to ask such things, I suppose."</w:t>
-        <w:br w:type="textWrapping"/>
-        <w:tab/>
+      </w:r>
+    </w:p>
+    <w:p>
+      <w:pPr>
+        <w:ind w:left="0" w:firstLine="720"/>
+        <w:rPr>
+          <w:rFonts w:ascii="Montserrat" w:cs="Montserrat" w:eastAsia="Montserrat" w:hAnsi="Montserrat"/>
+          <w:color w:val="ffffff"/>
+          <w:sz w:val="28"/>
+          <w:szCs w:val="28"/>
+        </w:rPr>
+      </w:pPr>
+      <w:r>
+        <w:rPr>
+          <w:rFonts w:ascii="Montserrat" w:cs="Montserrat" w:eastAsia="Montserrat" w:hAnsi="Montserrat"/>
+          <w:color w:val="ffffff"/>
+          <w:sz w:val="28"/>
+          <w:szCs w:val="28"/>
+          <w:rtl w:val="0"/>
+        </w:rPr>
         <w:t xml:space="preserve">“I suppose not," he replied. “That being said, it is not about weight, nor time. It is not a concept for the realm of </w:t>
       </w:r>
       <w:r>
@@ -590,8 +626,26 @@
           <w:rtl w:val="0"/>
         </w:rPr>
         <w:t xml:space="preserve">, and a flame flickered into being from the blackened wick. </w:t>
-        <w:br w:type="textWrapping"/>
-        <w:tab/>
+      </w:r>
+    </w:p>
+    <w:p>
+      <w:pPr>
+        <w:ind w:left="0" w:firstLine="720"/>
+        <w:rPr>
+          <w:rFonts w:ascii="Montserrat" w:cs="Montserrat" w:eastAsia="Montserrat" w:hAnsi="Montserrat"/>
+          <w:color w:val="ffffff"/>
+          <w:sz w:val="28"/>
+          <w:szCs w:val="28"/>
+        </w:rPr>
+      </w:pPr>
+      <w:r>
+        <w:rPr>
+          <w:rFonts w:ascii="Montserrat" w:cs="Montserrat" w:eastAsia="Montserrat" w:hAnsi="Montserrat"/>
+          <w:color w:val="ffffff"/>
+          <w:sz w:val="28"/>
+          <w:szCs w:val="28"/>
+          <w:rtl w:val="0"/>
+        </w:rPr>
         <w:t xml:space="preserve">"Lor’End," he began, his voice soft but probing</w:t>
       </w:r>
       <w:r>
@@ -617,8 +671,26 @@
         <w:t xml:space="preserve"> "It is, at this time, that the speaker gives testimony as to the nature of their lost loved one,” stated Ayen, looking at the lifeless hollows dug from the centre of the statue’s pupils. “Would you care to share your testimony of him with me?”</w:t>
         <w:br w:type="textWrapping"/>
         <w:t xml:space="preserve">Rigel sighed quietly.</w:t>
-        <w:br w:type="textWrapping"/>
-        <w:tab/>
+      </w:r>
+    </w:p>
+    <w:p>
+      <w:pPr>
+        <w:ind w:left="0" w:firstLine="720"/>
+        <w:rPr>
+          <w:rFonts w:ascii="Montserrat" w:cs="Montserrat" w:eastAsia="Montserrat" w:hAnsi="Montserrat"/>
+          <w:color w:val="ffffff"/>
+          <w:sz w:val="28"/>
+          <w:szCs w:val="28"/>
+        </w:rPr>
+      </w:pPr>
+      <w:r>
+        <w:rPr>
+          <w:rFonts w:ascii="Montserrat" w:cs="Montserrat" w:eastAsia="Montserrat" w:hAnsi="Montserrat"/>
+          <w:color w:val="ffffff"/>
+          <w:sz w:val="28"/>
+          <w:szCs w:val="28"/>
+          <w:rtl w:val="0"/>
+        </w:rPr>
         <w:t xml:space="preserve">“He was a father much as he was as a king, sire," said Rigel, without pause. “Although, kinder than many knew. A man of reason, always. And, a man of great appreciation of the world’s fine details.”</w:t>
       </w:r>
     </w:p>
@@ -641,8 +713,26 @@
           <w:rtl w:val="0"/>
         </w:rPr>
         <w:t xml:space="preserve">“Reason... and appreciation. These are attributes we do not often hear spoken of him, but they are fitting, I suppose," said Ayen, as Rigel placed the lit candle down on a small metal tray, raised on an oak bed, here where the resting soul of his Father might look down upon it and be soothed against whatever hell he had been cast into.</w:t>
-        <w:br w:type="textWrapping"/>
-        <w:tab/>
+      </w:r>
+    </w:p>
+    <w:p>
+      <w:pPr>
+        <w:ind w:left="0" w:firstLine="720"/>
+        <w:rPr>
+          <w:rFonts w:ascii="Montserrat" w:cs="Montserrat" w:eastAsia="Montserrat" w:hAnsi="Montserrat"/>
+          <w:color w:val="ffffff"/>
+          <w:sz w:val="28"/>
+          <w:szCs w:val="28"/>
+        </w:rPr>
+      </w:pPr>
+      <w:r>
+        <w:rPr>
+          <w:rFonts w:ascii="Montserrat" w:cs="Montserrat" w:eastAsia="Montserrat" w:hAnsi="Montserrat"/>
+          <w:color w:val="ffffff"/>
+          <w:sz w:val="28"/>
+          <w:szCs w:val="28"/>
+          <w:rtl w:val="0"/>
+        </w:rPr>
         <w:t xml:space="preserve">“Fitting, </w:t>
       </w:r>
       <w:r>
@@ -666,8 +756,26 @@
           <w:rtl w:val="0"/>
         </w:rPr>
         <w:t xml:space="preserve">when you get a word in your head, it is as though lodged like a bone in a dog’s jaw, as he ever drools and curls his tongue around it until it smells quite vile," said Rigel, rising to his feet and meeting Ayen’s warm and neutral gaze.</w:t>
-        <w:br w:type="textWrapping"/>
-        <w:tab/>
+      </w:r>
+    </w:p>
+    <w:p>
+      <w:pPr>
+        <w:ind w:left="0" w:firstLine="720"/>
+        <w:rPr>
+          <w:rFonts w:ascii="Montserrat" w:cs="Montserrat" w:eastAsia="Montserrat" w:hAnsi="Montserrat"/>
+          <w:color w:val="ffffff"/>
+          <w:sz w:val="28"/>
+          <w:szCs w:val="28"/>
+        </w:rPr>
+      </w:pPr>
+      <w:r>
+        <w:rPr>
+          <w:rFonts w:ascii="Montserrat" w:cs="Montserrat" w:eastAsia="Montserrat" w:hAnsi="Montserrat"/>
+          <w:color w:val="ffffff"/>
+          <w:sz w:val="28"/>
+          <w:szCs w:val="28"/>
+          <w:rtl w:val="0"/>
+        </w:rPr>
         <w:t xml:space="preserve">“You’re right. I apologise for the use of repetitive language. But, on the other hand, to have known him, not simply to have met with him so briefly, would have been an honour," replied Ayen, seemingly impervious to the frustration in the air, and his voice carrying a reverence that could so easily be mistaken for feigned sincerity.</w:t>
       </w:r>
     </w:p>
@@ -820,17 +928,89 @@
           <w:rtl w:val="0"/>
         </w:rPr>
         <w:t xml:space="preserve">name, again and again, even with her final breath. Yet steadfast you remained, much the same, after all.”</w:t>
-        <w:br w:type="textWrapping"/>
-        <w:tab/>
+      </w:r>
+    </w:p>
+    <w:p>
+      <w:pPr>
+        <w:ind w:left="0" w:firstLine="720"/>
+        <w:rPr>
+          <w:rFonts w:ascii="Montserrat" w:cs="Montserrat" w:eastAsia="Montserrat" w:hAnsi="Montserrat"/>
+          <w:color w:val="ffffff"/>
+          <w:sz w:val="28"/>
+          <w:szCs w:val="28"/>
+        </w:rPr>
+      </w:pPr>
+      <w:r>
+        <w:rPr>
+          <w:rFonts w:ascii="Montserrat" w:cs="Montserrat" w:eastAsia="Montserrat" w:hAnsi="Montserrat"/>
+          <w:color w:val="ffffff"/>
+          <w:sz w:val="28"/>
+          <w:szCs w:val="28"/>
+          <w:rtl w:val="0"/>
+        </w:rPr>
         <w:t xml:space="preserve">“Gwillen Maybel?” he said. “Yes, of course, the whole city seemed silent beside it, it was a potent sound.”</w:t>
-        <w:br w:type="textWrapping"/>
-        <w:tab/>
+      </w:r>
+    </w:p>
+    <w:p>
+      <w:pPr>
+        <w:ind w:left="0" w:firstLine="720"/>
+        <w:rPr>
+          <w:rFonts w:ascii="Montserrat" w:cs="Montserrat" w:eastAsia="Montserrat" w:hAnsi="Montserrat"/>
+          <w:color w:val="ffffff"/>
+          <w:sz w:val="28"/>
+          <w:szCs w:val="28"/>
+        </w:rPr>
+      </w:pPr>
+      <w:r>
+        <w:rPr>
+          <w:rFonts w:ascii="Montserrat" w:cs="Montserrat" w:eastAsia="Montserrat" w:hAnsi="Montserrat"/>
+          <w:color w:val="ffffff"/>
+          <w:sz w:val="28"/>
+          <w:szCs w:val="28"/>
+          <w:rtl w:val="0"/>
+        </w:rPr>
         <w:t xml:space="preserve">“At no point did that sound cause in you the urge to put an end to it, at the very least with a swift death?”</w:t>
-        <w:br w:type="textWrapping"/>
-        <w:tab/>
+      </w:r>
+    </w:p>
+    <w:p>
+      <w:pPr>
+        <w:ind w:left="0" w:firstLine="720"/>
+        <w:rPr>
+          <w:rFonts w:ascii="Montserrat" w:cs="Montserrat" w:eastAsia="Montserrat" w:hAnsi="Montserrat"/>
+          <w:color w:val="ffffff"/>
+          <w:sz w:val="28"/>
+          <w:szCs w:val="28"/>
+        </w:rPr>
+      </w:pPr>
+      <w:r>
+        <w:rPr>
+          <w:rFonts w:ascii="Montserrat" w:cs="Montserrat" w:eastAsia="Montserrat" w:hAnsi="Montserrat"/>
+          <w:color w:val="ffffff"/>
+          <w:sz w:val="28"/>
+          <w:szCs w:val="28"/>
+          <w:rtl w:val="0"/>
+        </w:rPr>
         <w:t xml:space="preserve">“I didn’t, because I heed your counsel. When people test boundaries, are they hoping to find them? That always seemed like something children do… to touch the edge just to see if it’s real.”</w:t>
-        <w:br w:type="textWrapping"/>
-        <w:tab/>
+      </w:r>
+    </w:p>
+    <w:p>
+      <w:pPr>
+        <w:ind w:left="0" w:firstLine="720"/>
+        <w:rPr>
+          <w:rFonts w:ascii="Montserrat" w:cs="Montserrat" w:eastAsia="Montserrat" w:hAnsi="Montserrat"/>
+          <w:color w:val="ffffff"/>
+          <w:sz w:val="28"/>
+          <w:szCs w:val="28"/>
+        </w:rPr>
+      </w:pPr>
+      <w:r>
+        <w:rPr>
+          <w:rFonts w:ascii="Montserrat" w:cs="Montserrat" w:eastAsia="Montserrat" w:hAnsi="Montserrat"/>
+          <w:color w:val="ffffff"/>
+          <w:sz w:val="28"/>
+          <w:szCs w:val="28"/>
+          <w:rtl w:val="0"/>
+        </w:rPr>
         <w:t xml:space="preserve">“No doubt her image will be carved into your statue, </w:t>
       </w:r>
       <w:r>
@@ -858,28 +1038,28 @@
     </w:p>
     <w:p>
       <w:pPr>
-        <w:rPr>
-          <w:rFonts w:ascii="Montserrat" w:cs="Montserrat" w:eastAsia="Montserrat" w:hAnsi="Montserrat"/>
-          <w:color w:val="ffffff"/>
-          <w:sz w:val="28"/>
-          <w:szCs w:val="28"/>
-        </w:rPr>
-      </w:pPr>
-      <w:r>
-        <w:rPr>
-          <w:rFonts w:ascii="Montserrat" w:cs="Montserrat" w:eastAsia="Montserrat" w:hAnsi="Montserrat"/>
-          <w:color w:val="ffffff"/>
-          <w:sz w:val="28"/>
-          <w:szCs w:val="28"/>
-          <w:rtl w:val="0"/>
-        </w:rPr>
-        <w:tab/>
+        <w:ind w:left="0" w:firstLine="720"/>
+        <w:rPr>
+          <w:rFonts w:ascii="Montserrat" w:cs="Montserrat" w:eastAsia="Montserrat" w:hAnsi="Montserrat"/>
+          <w:color w:val="ffffff"/>
+          <w:sz w:val="28"/>
+          <w:szCs w:val="28"/>
+        </w:rPr>
+      </w:pPr>
+      <w:r>
+        <w:rPr>
+          <w:rFonts w:ascii="Montserrat" w:cs="Montserrat" w:eastAsia="Montserrat" w:hAnsi="Montserrat"/>
+          <w:color w:val="ffffff"/>
+          <w:sz w:val="28"/>
+          <w:szCs w:val="28"/>
+          <w:rtl w:val="0"/>
+        </w:rPr>
         <w:t xml:space="preserve">“Perhaps, or perhaps not. Such concerns don’t weigh upon me, I have more pressing matters to attend to.”</w:t>
       </w:r>
     </w:p>
     <w:p>
       <w:pPr>
-        <w:ind w:firstLine="720"/>
+        <w:ind w:left="0" w:firstLine="720"/>
         <w:rPr>
           <w:rFonts w:ascii="Montserrat" w:cs="Montserrat" w:eastAsia="Montserrat" w:hAnsi="Montserrat"/>
           <w:color w:val="ffffff"/>
@@ -966,7 +1146,7 @@
     </w:p>
     <w:p>
       <w:pPr>
-        <w:ind w:firstLine="720"/>
+        <w:ind w:left="0" w:firstLine="720"/>
         <w:rPr>
           <w:rFonts w:ascii="Montserrat" w:cs="Montserrat" w:eastAsia="Montserrat" w:hAnsi="Montserrat"/>
           <w:color w:val="ffffff"/>
@@ -1009,22 +1189,22 @@
     </w:p>
     <w:p>
       <w:pPr>
-        <w:rPr>
-          <w:rFonts w:ascii="Montserrat" w:cs="Montserrat" w:eastAsia="Montserrat" w:hAnsi="Montserrat"/>
-          <w:color w:val="ffffff"/>
-          <w:sz w:val="28"/>
-          <w:szCs w:val="28"/>
-        </w:rPr>
-      </w:pPr>
-      <w:r>
-        <w:rPr>
-          <w:rFonts w:ascii="Montserrat" w:cs="Montserrat" w:eastAsia="Montserrat" w:hAnsi="Montserrat"/>
-          <w:color w:val="ffffff"/>
-          <w:sz w:val="28"/>
-          <w:szCs w:val="28"/>
-          <w:rtl w:val="0"/>
-        </w:rPr>
-        <w:tab/>
+        <w:ind w:left="0" w:firstLine="720"/>
+        <w:rPr>
+          <w:rFonts w:ascii="Montserrat" w:cs="Montserrat" w:eastAsia="Montserrat" w:hAnsi="Montserrat"/>
+          <w:color w:val="ffffff"/>
+          <w:sz w:val="28"/>
+          <w:szCs w:val="28"/>
+        </w:rPr>
+      </w:pPr>
+      <w:r>
+        <w:rPr>
+          <w:rFonts w:ascii="Montserrat" w:cs="Montserrat" w:eastAsia="Montserrat" w:hAnsi="Montserrat"/>
+          <w:color w:val="ffffff"/>
+          <w:sz w:val="28"/>
+          <w:szCs w:val="28"/>
+          <w:rtl w:val="0"/>
+        </w:rPr>
         <w:t xml:space="preserve">“You…” began Rigel, his eyes closing and his shaking fingers massaging the forehead above his right brow. “You are something that I cannot quite comprehend. You have no </w:t>
       </w:r>
       <w:r>
@@ -1052,7 +1232,7 @@
     </w:p>
     <w:p>
       <w:pPr>
-        <w:ind w:firstLine="720"/>
+        <w:ind w:left="0" w:firstLine="720"/>
         <w:rPr>
           <w:rFonts w:ascii="Montserrat" w:cs="Montserrat" w:eastAsia="Montserrat" w:hAnsi="Montserrat"/>
           <w:color w:val="ffffff"/>
@@ -1073,7 +1253,7 @@
     </w:p>
     <w:p>
       <w:pPr>
-        <w:ind w:firstLine="720"/>
+        <w:ind w:left="0" w:firstLine="720"/>
         <w:rPr>
           <w:rFonts w:ascii="Montserrat" w:cs="Montserrat" w:eastAsia="Montserrat" w:hAnsi="Montserrat"/>
           <w:color w:val="ffffff"/>
@@ -1112,14 +1292,32 @@
           <w:rtl w:val="0"/>
         </w:rPr>
         <w:t xml:space="preserve">good name, actually.”</w:t>
-        <w:br w:type="textWrapping"/>
-        <w:tab/>
+      </w:r>
+    </w:p>
+    <w:p>
+      <w:pPr>
+        <w:ind w:left="0" w:firstLine="720"/>
+        <w:rPr>
+          <w:rFonts w:ascii="Montserrat" w:cs="Montserrat" w:eastAsia="Montserrat" w:hAnsi="Montserrat"/>
+          <w:color w:val="ffffff"/>
+          <w:sz w:val="28"/>
+          <w:szCs w:val="28"/>
+        </w:rPr>
+      </w:pPr>
+      <w:r>
+        <w:rPr>
+          <w:rFonts w:ascii="Montserrat" w:cs="Montserrat" w:eastAsia="Montserrat" w:hAnsi="Montserrat"/>
+          <w:color w:val="ffffff"/>
+          <w:sz w:val="28"/>
+          <w:szCs w:val="28"/>
+          <w:rtl w:val="0"/>
+        </w:rPr>
         <w:t xml:space="preserve">“May she serve as an example, then. A reminder to others that the written word, when used recklessly, can be a weapon that will not be tolerated," said Ayen, matter-of-factly. “We must protect the people from corruption, whether by deceit, illusion, or malice," his words were flat and without much emotion, as he tilted his head to look up at Lor’End’s stone face again, the candlelight casting a flickering shadow of his nose across the same stark cheekbones he shared with his son.</w:t>
       </w:r>
     </w:p>
     <w:p>
       <w:pPr>
-        <w:ind w:firstLine="720"/>
+        <w:ind w:left="0" w:firstLine="720"/>
         <w:rPr>
           <w:rFonts w:ascii="Montserrat" w:cs="Montserrat" w:eastAsia="Montserrat" w:hAnsi="Montserrat"/>
           <w:color w:val="ffffff"/>
@@ -1162,6 +1360,67 @@
     </w:p>
     <w:p>
       <w:pPr>
+        <w:ind w:left="0" w:firstLine="720"/>
+        <w:rPr>
+          <w:rFonts w:ascii="Montserrat" w:cs="Montserrat" w:eastAsia="Montserrat" w:hAnsi="Montserrat"/>
+          <w:color w:val="ffffff"/>
+          <w:sz w:val="28"/>
+          <w:szCs w:val="28"/>
+        </w:rPr>
+      </w:pPr>
+      <w:r>
+        <w:rPr>
+          <w:rFonts w:ascii="Montserrat" w:cs="Montserrat" w:eastAsia="Montserrat" w:hAnsi="Montserrat"/>
+          <w:color w:val="ffffff"/>
+          <w:sz w:val="28"/>
+          <w:szCs w:val="28"/>
+          <w:rtl w:val="0"/>
+        </w:rPr>
+        <w:t xml:space="preserve">“A press that bends the truth must cease, for lies will tarnish our realm's peace. Banish falsehood, let truth prevail, and justice stand where words may fail," said Ayen, with barely a moment to think of rhyming terms, as though he pulled it from a wizard's hat. His tattered brain must be forever wandering about, pondering everything and anything that failed to fall under the umbrella of Crown duty.</w:t>
+      </w:r>
+    </w:p>
+    <w:p>
+      <w:pPr>
+        <w:rPr>
+          <w:rFonts w:ascii="Montserrat" w:cs="Montserrat" w:eastAsia="Montserrat" w:hAnsi="Montserrat"/>
+          <w:color w:val="ffffff"/>
+          <w:sz w:val="28"/>
+          <w:szCs w:val="28"/>
+        </w:rPr>
+      </w:pPr>
+      <w:r>
+        <w:rPr>
+          <w:rFonts w:ascii="Montserrat" w:cs="Montserrat" w:eastAsia="Montserrat" w:hAnsi="Montserrat"/>
+          <w:color w:val="ffffff"/>
+          <w:sz w:val="28"/>
+          <w:szCs w:val="28"/>
+          <w:rtl w:val="0"/>
+        </w:rPr>
+        <w:t xml:space="preserve">Rigel’s finger fell to stroke his bottom lip, and his inner voice was silenced. He had nothing to say, nothing at all. “I must continue with my work here tonight, so you ought to leave now, if you’ve mourned sufficiently," said the King.</w:t>
+      </w:r>
+    </w:p>
+    <w:p>
+      <w:pPr>
+        <w:rPr>
+          <w:rFonts w:ascii="Montserrat" w:cs="Montserrat" w:eastAsia="Montserrat" w:hAnsi="Montserrat"/>
+          <w:color w:val="ffffff"/>
+          <w:sz w:val="28"/>
+          <w:szCs w:val="28"/>
+        </w:rPr>
+      </w:pPr>
+      <w:r>
+        <w:rPr>
+          <w:rFonts w:ascii="Montserrat" w:cs="Montserrat" w:eastAsia="Montserrat" w:hAnsi="Montserrat"/>
+          <w:color w:val="ffffff"/>
+          <w:sz w:val="28"/>
+          <w:szCs w:val="28"/>
+          <w:rtl w:val="0"/>
+        </w:rPr>
+        <w:t xml:space="preserve">Rigel looked down at his own shoulder for a split second, lost in the ornamentation of the silver strapped to it, before snapping back into the moment. The thoughts that had momentarily consumed him, all now discarded, never to have existed at all.</w:t>
+      </w:r>
+    </w:p>
+    <w:p>
+      <w:pPr>
         <w:ind w:firstLine="720"/>
         <w:rPr>
           <w:rFonts w:ascii="Montserrat" w:cs="Montserrat" w:eastAsia="Montserrat" w:hAnsi="Montserrat"/>
@@ -1178,67 +1437,6 @@
           <w:szCs w:val="28"/>
           <w:rtl w:val="0"/>
         </w:rPr>
-        <w:t xml:space="preserve">“A press that bends the truth must cease, for lies will tarnish our realm's peace. Banish falsehood, let truth prevail, and justice stand where words may fail," said Ayen, with barely a moment to think of rhyming terms, as though he pulled it from a wizard's hat. His tattered brain must be forever wandering about, pondering everything and anything that failed to fall under the umbrella of Crown duty.</w:t>
-      </w:r>
-    </w:p>
-    <w:p>
-      <w:pPr>
-        <w:rPr>
-          <w:rFonts w:ascii="Montserrat" w:cs="Montserrat" w:eastAsia="Montserrat" w:hAnsi="Montserrat"/>
-          <w:color w:val="ffffff"/>
-          <w:sz w:val="28"/>
-          <w:szCs w:val="28"/>
-        </w:rPr>
-      </w:pPr>
-      <w:r>
-        <w:rPr>
-          <w:rFonts w:ascii="Montserrat" w:cs="Montserrat" w:eastAsia="Montserrat" w:hAnsi="Montserrat"/>
-          <w:color w:val="ffffff"/>
-          <w:sz w:val="28"/>
-          <w:szCs w:val="28"/>
-          <w:rtl w:val="0"/>
-        </w:rPr>
-        <w:t xml:space="preserve">Rigel’s finger fell to stroke his bottom lip, and his inner voice was silenced. He had nothing to say, nothing at all. “I must continue with my work here tonight, so you ought to leave now, if you’ve mourned sufficiently," said the King.</w:t>
-      </w:r>
-    </w:p>
-    <w:p>
-      <w:pPr>
-        <w:rPr>
-          <w:rFonts w:ascii="Montserrat" w:cs="Montserrat" w:eastAsia="Montserrat" w:hAnsi="Montserrat"/>
-          <w:color w:val="ffffff"/>
-          <w:sz w:val="28"/>
-          <w:szCs w:val="28"/>
-        </w:rPr>
-      </w:pPr>
-      <w:r>
-        <w:rPr>
-          <w:rFonts w:ascii="Montserrat" w:cs="Montserrat" w:eastAsia="Montserrat" w:hAnsi="Montserrat"/>
-          <w:color w:val="ffffff"/>
-          <w:sz w:val="28"/>
-          <w:szCs w:val="28"/>
-          <w:rtl w:val="0"/>
-        </w:rPr>
-        <w:t xml:space="preserve">Rigel looked down at his own shoulder for a split second, lost in the ornamentation of the silver strapped to it, before snapping back into the moment. The thoughts that had momentarily consumed him, all now discarded, never to have existed at all.</w:t>
-      </w:r>
-    </w:p>
-    <w:p>
-      <w:pPr>
-        <w:rPr>
-          <w:rFonts w:ascii="Montserrat" w:cs="Montserrat" w:eastAsia="Montserrat" w:hAnsi="Montserrat"/>
-          <w:color w:val="ffffff"/>
-          <w:sz w:val="28"/>
-          <w:szCs w:val="28"/>
-        </w:rPr>
-      </w:pPr>
-      <w:r>
-        <w:rPr>
-          <w:rFonts w:ascii="Montserrat" w:cs="Montserrat" w:eastAsia="Montserrat" w:hAnsi="Montserrat"/>
-          <w:color w:val="ffffff"/>
-          <w:sz w:val="28"/>
-          <w:szCs w:val="28"/>
-          <w:rtl w:val="0"/>
-        </w:rPr>
-        <w:tab/>
         <w:t xml:space="preserve">“Yes, yes of course, </w:t>
       </w:r>
       <w:r>
@@ -1266,22 +1464,22 @@
     </w:p>
     <w:p>
       <w:pPr>
-        <w:rPr>
-          <w:rFonts w:ascii="Montserrat" w:cs="Montserrat" w:eastAsia="Montserrat" w:hAnsi="Montserrat"/>
-          <w:color w:val="ffffff"/>
-          <w:sz w:val="28"/>
-          <w:szCs w:val="28"/>
-        </w:rPr>
-      </w:pPr>
-      <w:r>
-        <w:rPr>
-          <w:rFonts w:ascii="Montserrat" w:cs="Montserrat" w:eastAsia="Montserrat" w:hAnsi="Montserrat"/>
-          <w:color w:val="ffffff"/>
-          <w:sz w:val="28"/>
-          <w:szCs w:val="28"/>
-          <w:rtl w:val="0"/>
-        </w:rPr>
-        <w:tab/>
+        <w:ind w:firstLine="720"/>
+        <w:rPr>
+          <w:rFonts w:ascii="Montserrat" w:cs="Montserrat" w:eastAsia="Montserrat" w:hAnsi="Montserrat"/>
+          <w:color w:val="ffffff"/>
+          <w:sz w:val="28"/>
+          <w:szCs w:val="28"/>
+        </w:rPr>
+      </w:pPr>
+      <w:r>
+        <w:rPr>
+          <w:rFonts w:ascii="Montserrat" w:cs="Montserrat" w:eastAsia="Montserrat" w:hAnsi="Montserrat"/>
+          <w:color w:val="ffffff"/>
+          <w:sz w:val="28"/>
+          <w:szCs w:val="28"/>
+          <w:rtl w:val="0"/>
+        </w:rPr>
         <w:t xml:space="preserve">“I’ll be there, as fresh as a daisy!” said Ayen, gesturing his arm in the direction of the door Rigel had entered through, a few paces behind them both. They stepped away from the burning candle, and the flame shuddered in the passing air that their cloaks threw about. </w:t>
       </w:r>
     </w:p>
@@ -1412,7 +1610,7 @@
     </w:p>
     <w:p>
       <w:pPr>
-        <w:ind w:firstLine="720"/>
+        <w:ind w:left="0" w:firstLine="720"/>
         <w:rPr>
           <w:rFonts w:ascii="Montserrat" w:cs="Montserrat" w:eastAsia="Montserrat" w:hAnsi="Montserrat"/>
           <w:color w:val="ffffff"/>
@@ -1433,7 +1631,7 @@
     </w:p>
     <w:p>
       <w:pPr>
-        <w:ind w:firstLine="720"/>
+        <w:ind w:left="0" w:firstLine="720"/>
         <w:rPr>
           <w:rFonts w:ascii="Montserrat" w:cs="Montserrat" w:eastAsia="Montserrat" w:hAnsi="Montserrat"/>
           <w:color w:val="ffffff"/>
@@ -1476,7 +1674,7 @@
     </w:p>
     <w:p>
       <w:pPr>
-        <w:ind w:firstLine="720"/>
+        <w:ind w:left="0" w:firstLine="720"/>
         <w:rPr>
           <w:rFonts w:ascii="Montserrat" w:cs="Montserrat" w:eastAsia="Montserrat" w:hAnsi="Montserrat"/>
           <w:color w:val="ffffff"/>
@@ -1497,7 +1695,7 @@
     </w:p>
     <w:p>
       <w:pPr>
-        <w:ind w:firstLine="720"/>
+        <w:ind w:left="0" w:firstLine="720"/>
         <w:rPr>
           <w:rFonts w:ascii="Montserrat" w:cs="Montserrat" w:eastAsia="Montserrat" w:hAnsi="Montserrat"/>
           <w:color w:val="ffffff"/>
@@ -1799,85 +1997,85 @@
     </w:p>
     <w:p>
       <w:pPr>
-        <w:rPr>
-          <w:rFonts w:ascii="Montserrat" w:cs="Montserrat" w:eastAsia="Montserrat" w:hAnsi="Montserrat"/>
-          <w:color w:val="ffffff"/>
-          <w:sz w:val="28"/>
-          <w:szCs w:val="28"/>
-        </w:rPr>
-      </w:pPr>
-      <w:r>
-        <w:rPr>
-          <w:rFonts w:ascii="Montserrat" w:cs="Montserrat" w:eastAsia="Montserrat" w:hAnsi="Montserrat"/>
-          <w:color w:val="ffffff"/>
-          <w:sz w:val="28"/>
-          <w:szCs w:val="28"/>
-          <w:rtl w:val="0"/>
-        </w:rPr>
-        <w:tab/>
+        <w:ind w:firstLine="720"/>
+        <w:rPr>
+          <w:rFonts w:ascii="Montserrat" w:cs="Montserrat" w:eastAsia="Montserrat" w:hAnsi="Montserrat"/>
+          <w:color w:val="ffffff"/>
+          <w:sz w:val="28"/>
+          <w:szCs w:val="28"/>
+        </w:rPr>
+      </w:pPr>
+      <w:r>
+        <w:rPr>
+          <w:rFonts w:ascii="Montserrat" w:cs="Montserrat" w:eastAsia="Montserrat" w:hAnsi="Montserrat"/>
+          <w:color w:val="ffffff"/>
+          <w:sz w:val="28"/>
+          <w:szCs w:val="28"/>
+          <w:rtl w:val="0"/>
+        </w:rPr>
         <w:t xml:space="preserve">“Where were you," asked Rigel, although it bore little resemblance to a question.</w:t>
       </w:r>
     </w:p>
     <w:p>
       <w:pPr>
-        <w:rPr>
-          <w:rFonts w:ascii="Montserrat" w:cs="Montserrat" w:eastAsia="Montserrat" w:hAnsi="Montserrat"/>
-          <w:color w:val="ffffff"/>
-          <w:sz w:val="28"/>
-          <w:szCs w:val="28"/>
-        </w:rPr>
-      </w:pPr>
-      <w:r>
-        <w:rPr>
-          <w:rFonts w:ascii="Montserrat" w:cs="Montserrat" w:eastAsia="Montserrat" w:hAnsi="Montserrat"/>
-          <w:color w:val="ffffff"/>
-          <w:sz w:val="28"/>
-          <w:szCs w:val="28"/>
-          <w:rtl w:val="0"/>
-        </w:rPr>
-        <w:tab/>
+        <w:ind w:firstLine="720"/>
+        <w:rPr>
+          <w:rFonts w:ascii="Montserrat" w:cs="Montserrat" w:eastAsia="Montserrat" w:hAnsi="Montserrat"/>
+          <w:color w:val="ffffff"/>
+          <w:sz w:val="28"/>
+          <w:szCs w:val="28"/>
+        </w:rPr>
+      </w:pPr>
+      <w:r>
+        <w:rPr>
+          <w:rFonts w:ascii="Montserrat" w:cs="Montserrat" w:eastAsia="Montserrat" w:hAnsi="Montserrat"/>
+          <w:color w:val="ffffff"/>
+          <w:sz w:val="28"/>
+          <w:szCs w:val="28"/>
+          <w:rtl w:val="0"/>
+        </w:rPr>
         <w:t xml:space="preserve">“I’m so sorry, I had to make some last-moment changes to the King’s speech.”</w:t>
       </w:r>
     </w:p>
     <w:p>
       <w:pPr>
-        <w:rPr>
-          <w:rFonts w:ascii="Montserrat" w:cs="Montserrat" w:eastAsia="Montserrat" w:hAnsi="Montserrat"/>
-          <w:color w:val="ffffff"/>
-          <w:sz w:val="28"/>
-          <w:szCs w:val="28"/>
-        </w:rPr>
-      </w:pPr>
-      <w:r>
-        <w:rPr>
-          <w:rFonts w:ascii="Montserrat" w:cs="Montserrat" w:eastAsia="Montserrat" w:hAnsi="Montserrat"/>
-          <w:color w:val="ffffff"/>
-          <w:sz w:val="28"/>
-          <w:szCs w:val="28"/>
-          <w:rtl w:val="0"/>
-        </w:rPr>
-        <w:tab/>
+        <w:ind w:firstLine="720"/>
+        <w:rPr>
+          <w:rFonts w:ascii="Montserrat" w:cs="Montserrat" w:eastAsia="Montserrat" w:hAnsi="Montserrat"/>
+          <w:color w:val="ffffff"/>
+          <w:sz w:val="28"/>
+          <w:szCs w:val="28"/>
+        </w:rPr>
+      </w:pPr>
+      <w:r>
+        <w:rPr>
+          <w:rFonts w:ascii="Montserrat" w:cs="Montserrat" w:eastAsia="Montserrat" w:hAnsi="Montserrat"/>
+          <w:color w:val="ffffff"/>
+          <w:sz w:val="28"/>
+          <w:szCs w:val="28"/>
+          <w:rtl w:val="0"/>
+        </w:rPr>
         <w:t xml:space="preserve">“At his request?” he said, with a genuine curiosity this time.</w:t>
       </w:r>
     </w:p>
     <w:p>
       <w:pPr>
-        <w:rPr>
-          <w:rFonts w:ascii="Montserrat" w:cs="Montserrat" w:eastAsia="Montserrat" w:hAnsi="Montserrat"/>
-          <w:color w:val="ffffff"/>
-          <w:sz w:val="28"/>
-          <w:szCs w:val="28"/>
-        </w:rPr>
-      </w:pPr>
-      <w:r>
-        <w:rPr>
-          <w:rFonts w:ascii="Montserrat" w:cs="Montserrat" w:eastAsia="Montserrat" w:hAnsi="Montserrat"/>
-          <w:color w:val="ffffff"/>
-          <w:sz w:val="28"/>
-          <w:szCs w:val="28"/>
-          <w:rtl w:val="0"/>
-        </w:rPr>
-        <w:tab/>
+        <w:ind w:firstLine="720"/>
+        <w:rPr>
+          <w:rFonts w:ascii="Montserrat" w:cs="Montserrat" w:eastAsia="Montserrat" w:hAnsi="Montserrat"/>
+          <w:color w:val="ffffff"/>
+          <w:sz w:val="28"/>
+          <w:szCs w:val="28"/>
+        </w:rPr>
+      </w:pPr>
+      <w:r>
+        <w:rPr>
+          <w:rFonts w:ascii="Montserrat" w:cs="Montserrat" w:eastAsia="Montserrat" w:hAnsi="Montserrat"/>
+          <w:color w:val="ffffff"/>
+          <w:sz w:val="28"/>
+          <w:szCs w:val="28"/>
+          <w:rtl w:val="0"/>
+        </w:rPr>
         <w:t xml:space="preserve">“Yes, actually," she said, quickly taking off her own red and black, cloaked suit to bare a laced brassiere hiding her breasts above a taut and muscular midriff. “He said it was too </w:t>
       </w:r>
       <w:r>
@@ -1905,22 +2103,22 @@
     </w:p>
     <w:p>
       <w:pPr>
-        <w:rPr>
-          <w:rFonts w:ascii="Montserrat" w:cs="Montserrat" w:eastAsia="Montserrat" w:hAnsi="Montserrat"/>
-          <w:color w:val="ffffff"/>
-          <w:sz w:val="28"/>
-          <w:szCs w:val="28"/>
-        </w:rPr>
-      </w:pPr>
-      <w:r>
-        <w:rPr>
-          <w:rFonts w:ascii="Montserrat" w:cs="Montserrat" w:eastAsia="Montserrat" w:hAnsi="Montserrat"/>
-          <w:color w:val="ffffff"/>
-          <w:sz w:val="28"/>
-          <w:szCs w:val="28"/>
-          <w:rtl w:val="0"/>
-        </w:rPr>
-        <w:tab/>
+        <w:ind w:firstLine="720"/>
+        <w:rPr>
+          <w:rFonts w:ascii="Montserrat" w:cs="Montserrat" w:eastAsia="Montserrat" w:hAnsi="Montserrat"/>
+          <w:color w:val="ffffff"/>
+          <w:sz w:val="28"/>
+          <w:szCs w:val="28"/>
+        </w:rPr>
+      </w:pPr>
+      <w:r>
+        <w:rPr>
+          <w:rFonts w:ascii="Montserrat" w:cs="Montserrat" w:eastAsia="Montserrat" w:hAnsi="Montserrat"/>
+          <w:color w:val="ffffff"/>
+          <w:sz w:val="28"/>
+          <w:szCs w:val="28"/>
+          <w:rtl w:val="0"/>
+        </w:rPr>
         <w:t xml:space="preserve">“Leave that on," said Rigel, sharply, freezing Aylenne’s hand on the tail of the bow of her underwear. She released her grip, and then her breath. “He certainly is becoming bolder, it’s disconcerting." He spoke again, more softly now, glaring into the dark of the frog’s mouth as the water poured out from it and cascaded into the tub. </w:t>
       </w:r>
     </w:p>
@@ -1946,22 +2144,22 @@
     </w:p>
     <w:p>
       <w:pPr>
-        <w:rPr>
-          <w:rFonts w:ascii="Montserrat" w:cs="Montserrat" w:eastAsia="Montserrat" w:hAnsi="Montserrat"/>
-          <w:color w:val="ffffff"/>
-          <w:sz w:val="28"/>
-          <w:szCs w:val="28"/>
-        </w:rPr>
-      </w:pPr>
-      <w:r>
-        <w:rPr>
-          <w:rFonts w:ascii="Montserrat" w:cs="Montserrat" w:eastAsia="Montserrat" w:hAnsi="Montserrat"/>
-          <w:color w:val="ffffff"/>
-          <w:sz w:val="28"/>
-          <w:szCs w:val="28"/>
-          <w:rtl w:val="0"/>
-        </w:rPr>
-        <w:tab/>
+        <w:ind w:firstLine="720"/>
+        <w:rPr>
+          <w:rFonts w:ascii="Montserrat" w:cs="Montserrat" w:eastAsia="Montserrat" w:hAnsi="Montserrat"/>
+          <w:color w:val="ffffff"/>
+          <w:sz w:val="28"/>
+          <w:szCs w:val="28"/>
+        </w:rPr>
+      </w:pPr>
+      <w:r>
+        <w:rPr>
+          <w:rFonts w:ascii="Montserrat" w:cs="Montserrat" w:eastAsia="Montserrat" w:hAnsi="Montserrat"/>
+          <w:color w:val="ffffff"/>
+          <w:sz w:val="28"/>
+          <w:szCs w:val="28"/>
+          <w:rtl w:val="0"/>
+        </w:rPr>
         <w:t xml:space="preserve">“He said Lord Barius has a special kind of Scarlett, that it has vital information on it, it’s a </w:t>
       </w:r>
       <w:r>
@@ -1989,28 +2187,28 @@
     </w:p>
     <w:p>
       <w:pPr>
-        <w:rPr>
-          <w:rFonts w:ascii="Montserrat" w:cs="Montserrat" w:eastAsia="Montserrat" w:hAnsi="Montserrat"/>
-          <w:color w:val="ffffff"/>
-          <w:sz w:val="28"/>
-          <w:szCs w:val="28"/>
-        </w:rPr>
-      </w:pPr>
-      <w:r>
-        <w:rPr>
-          <w:rFonts w:ascii="Montserrat" w:cs="Montserrat" w:eastAsia="Montserrat" w:hAnsi="Montserrat"/>
-          <w:color w:val="ffffff"/>
-          <w:sz w:val="28"/>
-          <w:szCs w:val="28"/>
-          <w:rtl w:val="0"/>
-        </w:rPr>
-        <w:tab/>
+        <w:ind w:left="0" w:firstLine="720"/>
+        <w:rPr>
+          <w:rFonts w:ascii="Montserrat" w:cs="Montserrat" w:eastAsia="Montserrat" w:hAnsi="Montserrat"/>
+          <w:color w:val="ffffff"/>
+          <w:sz w:val="28"/>
+          <w:szCs w:val="28"/>
+        </w:rPr>
+      </w:pPr>
+      <w:r>
+        <w:rPr>
+          <w:rFonts w:ascii="Montserrat" w:cs="Montserrat" w:eastAsia="Montserrat" w:hAnsi="Montserrat"/>
+          <w:color w:val="ffffff"/>
+          <w:sz w:val="28"/>
+          <w:szCs w:val="28"/>
+          <w:rtl w:val="0"/>
+        </w:rPr>
         <w:t xml:space="preserve">“What is all this vital to? Strange, it’s so very strange! These may be the days something long hidden rears its head," he said, feeling Aylenne’s gentle nails tease the braid from his hair, darkly glistening, and run the tips of her fingers through the threads as she freed them. “His dealings with the Ministry of Istuis, he has completely overruled my contact with Tecma at this point, not one of them will correspond with me regarding these new defence installations.”</w:t>
       </w:r>
     </w:p>
     <w:p>
       <w:pPr>
-        <w:ind w:firstLine="720"/>
+        <w:ind w:left="0" w:firstLine="720"/>
         <w:rPr>
           <w:rFonts w:ascii="Montserrat" w:cs="Montserrat" w:eastAsia="Montserrat" w:hAnsi="Montserrat"/>
           <w:color w:val="ffffff"/>
@@ -2031,7 +2229,7 @@
     </w:p>
     <w:p>
       <w:pPr>
-        <w:ind w:firstLine="720"/>
+        <w:ind w:left="0" w:firstLine="720"/>
         <w:rPr>
           <w:rFonts w:ascii="Montserrat" w:cs="Montserrat" w:eastAsia="Montserrat" w:hAnsi="Montserrat"/>
           <w:color w:val="ffffff"/>

</xml_diff>